<commit_message>
due to lack of available downloadable datasets online, we are either gonna access them using huggingface datasets or generate them ourselves
</commit_message>
<xml_diff>
--- a/human trace features.docx
+++ b/human trace features.docx
@@ -456,13 +456,8 @@
     </w:tbl>
     <w:p/>
     <w:p>
-      <w:proofErr w:type="spellStart"/>
-      <w:r>
-        <w:t>feature_engine</w:t>
-      </w:r>
-      <w:proofErr w:type="spellEnd"/>
-      <w:r>
-        <w:t>/</w:t>
+      <w:r>
+        <w:t>feature_engine/</w:t>
       </w:r>
     </w:p>
     <w:p>
@@ -525,12 +520,10 @@
         <w:spacing w:after="0"/>
         <w:jc w:val="center"/>
       </w:pPr>
-      <w:proofErr w:type="spellStart"/>
       <w:r>
         <w:lastRenderedPageBreak/>
         <w:t>HumanTrace</w:t>
       </w:r>
-      <w:proofErr w:type="spellEnd"/>
     </w:p>
     <w:p>
       <w:pPr>
@@ -1173,21 +1166,8 @@
         <w:t>──</w:t>
       </w:r>
       <w:r>
-        <w:t xml:space="preserve"> </w:t>
-      </w:r>
-      <w:proofErr w:type="spellStart"/>
-      <w:r>
-        <w:t>LightGBM</w:t>
-      </w:r>
-      <w:proofErr w:type="spellEnd"/>
-      <w:r>
-        <w:t xml:space="preserve"> / </w:t>
-      </w:r>
-      <w:proofErr w:type="spellStart"/>
-      <w:r>
-        <w:t>XGBoost</w:t>
-      </w:r>
-      <w:proofErr w:type="spellEnd"/>
+        <w:t xml:space="preserve"> LightGBM / XGBoost</w:t>
+      </w:r>
     </w:p>
     <w:p>
       <w:pPr>
@@ -1527,13 +1507,8 @@
       <w:pPr>
         <w:spacing w:after="0"/>
       </w:pPr>
-      <w:proofErr w:type="spellStart"/>
-      <w:r>
-        <w:t>HumanTrace</w:t>
-      </w:r>
-      <w:proofErr w:type="spellEnd"/>
-      <w:r>
-        <w:t xml:space="preserve"> Engine</w:t>
+      <w:r>
+        <w:t>HumanTrace Engine</w:t>
       </w:r>
     </w:p>
     <w:p>
@@ -1743,14 +1718,9 @@
       <w:pPr>
         <w:spacing w:after="0"/>
       </w:pPr>
-      <w:proofErr w:type="spellStart"/>
       <w:r>
         <w:lastRenderedPageBreak/>
-        <w:t>humantrace</w:t>
-      </w:r>
-      <w:proofErr w:type="spellEnd"/>
-      <w:r>
-        <w:t>/</w:t>
+        <w:t>humantrace/</w:t>
       </w:r>
     </w:p>
     <w:p>
@@ -2039,15 +2009,7 @@
         <w:t>──</w:t>
       </w:r>
       <w:r>
-        <w:t xml:space="preserve"> </w:t>
-      </w:r>
-      <w:proofErr w:type="spellStart"/>
-      <w:r>
-        <w:t>feature_engine</w:t>
-      </w:r>
-      <w:proofErr w:type="spellEnd"/>
-      <w:r>
-        <w:t>/</w:t>
+        <w:t xml:space="preserve"> feature_engine/</w:t>
       </w:r>
     </w:p>
     <w:p>
@@ -2655,15 +2617,7 @@
         <w:spacing w:after="0"/>
       </w:pPr>
       <w:r>
-        <w:t xml:space="preserve">└── </w:t>
-      </w:r>
-      <w:proofErr w:type="spellStart"/>
-      <w:r>
-        <w:t>api</w:t>
-      </w:r>
-      <w:proofErr w:type="spellEnd"/>
-      <w:r>
-        <w:t>/</w:t>
+        <w:t>└── api/</w:t>
       </w:r>
     </w:p>
     <w:p>
@@ -2726,63 +2680,31 @@
         <w:spacing w:after="0"/>
       </w:pPr>
       <w:r>
-        <w:t xml:space="preserve">6. </w:t>
-      </w:r>
-      <w:proofErr w:type="spellStart"/>
-      <w:r>
-        <w:t>feature_engine</w:t>
-      </w:r>
-      <w:proofErr w:type="spellEnd"/>
-      <w:r>
-        <w:t>/lexical/</w:t>
-      </w:r>
-    </w:p>
-    <w:p>
-      <w:pPr>
-        <w:spacing w:after="0"/>
-      </w:pPr>
-      <w:r>
-        <w:t xml:space="preserve">7. </w:t>
-      </w:r>
-      <w:proofErr w:type="spellStart"/>
-      <w:r>
-        <w:t>feature_engine</w:t>
-      </w:r>
-      <w:proofErr w:type="spellEnd"/>
-      <w:r>
-        <w:t>/readability/</w:t>
-      </w:r>
-    </w:p>
-    <w:p>
-      <w:pPr>
-        <w:spacing w:after="0"/>
-      </w:pPr>
-      <w:r>
-        <w:t xml:space="preserve">8. </w:t>
-      </w:r>
-      <w:proofErr w:type="spellStart"/>
-      <w:r>
-        <w:t>feature_engine</w:t>
-      </w:r>
-      <w:proofErr w:type="spellEnd"/>
-      <w:r>
-        <w:t>/stylometry/</w:t>
-      </w:r>
-    </w:p>
-    <w:p>
-      <w:pPr>
-        <w:spacing w:after="0"/>
-      </w:pPr>
-      <w:r>
-        <w:t xml:space="preserve">9. </w:t>
-      </w:r>
-      <w:proofErr w:type="spellStart"/>
-      <w:r>
-        <w:t>feature_engine</w:t>
-      </w:r>
-      <w:proofErr w:type="spellEnd"/>
-      <w:r>
-        <w:t>/syntax/</w:t>
+        <w:t>6. feature_engine/lexical/</w:t>
+      </w:r>
+    </w:p>
+    <w:p>
+      <w:pPr>
+        <w:spacing w:after="0"/>
+      </w:pPr>
+      <w:r>
+        <w:t>7. feature_engine/readability/</w:t>
+      </w:r>
+    </w:p>
+    <w:p>
+      <w:pPr>
+        <w:spacing w:after="0"/>
+      </w:pPr>
+      <w:r>
+        <w:t>8. feature_engine/stylometry/</w:t>
+      </w:r>
+    </w:p>
+    <w:p>
+      <w:pPr>
+        <w:spacing w:after="0"/>
+      </w:pPr>
+      <w:r>
+        <w:t>9. feature_engine/syntax/</w:t>
       </w:r>
     </w:p>
     <w:p>
@@ -2956,13 +2878,8 @@
         <w:jc w:val="center"/>
       </w:pPr>
       <w:r>
-        <w:t xml:space="preserve">               </w:t>
-      </w:r>
-      <w:proofErr w:type="spellStart"/>
-      <w:r>
-        <w:t>EssayDocument</w:t>
-      </w:r>
-      <w:proofErr w:type="spellEnd"/>
+        <w:t xml:space="preserve">               EssayDocument</w:t>
+      </w:r>
     </w:p>
     <w:p>
       <w:pPr>
@@ -3603,13 +3520,8 @@
               <w:spacing w:after="0"/>
             </w:pPr>
             <w:r>
-              <w:t xml:space="preserve">Vocabulary </w:t>
+              <w:t>Vocabulary behavior</w:t>
             </w:r>
-            <w:proofErr w:type="spellStart"/>
-            <w:r>
-              <w:t>behavior</w:t>
-            </w:r>
-            <w:proofErr w:type="spellEnd"/>
           </w:p>
         </w:tc>
       </w:tr>
@@ -4786,6 +4698,1413 @@
       <w:pPr>
         <w:spacing w:after="0"/>
       </w:pPr>
+      <w:r>
+        <w:t>We need categories like:</w:t>
+      </w:r>
+    </w:p>
+    <w:p>
+      <w:pPr>
+        <w:spacing w:after="0"/>
+      </w:pPr>
+      <w:r>
+        <w:t>HUMAN</w:t>
+      </w:r>
+    </w:p>
+    <w:p>
+      <w:pPr>
+        <w:spacing w:after="0"/>
+      </w:pPr>
+      <w:r>
+        <w:t>AI_GENERATED</w:t>
+      </w:r>
+    </w:p>
+    <w:p>
+      <w:pPr>
+        <w:spacing w:after="0"/>
+      </w:pPr>
+      <w:r>
+        <w:t>AI_POLISHED</w:t>
+      </w:r>
+    </w:p>
+    <w:p>
+      <w:pPr>
+        <w:spacing w:after="0"/>
+      </w:pPr>
+      <w:r>
+        <w:t>HUMAN_REVISED</w:t>
+      </w:r>
+    </w:p>
+    <w:p>
+      <w:pPr>
+        <w:spacing w:after="0"/>
+      </w:pPr>
+      <w:r>
+        <w:t>and metadata such as:</w:t>
+      </w:r>
+    </w:p>
+    <w:p>
+      <w:pPr>
+        <w:spacing w:after="0"/>
+      </w:pPr>
+      <w:r>
+        <w:t>essay_id</w:t>
+      </w:r>
+    </w:p>
+    <w:p>
+      <w:pPr>
+        <w:spacing w:after="0"/>
+      </w:pPr>
+      <w:r>
+        <w:t>label</w:t>
+      </w:r>
+    </w:p>
+    <w:p>
+      <w:pPr>
+        <w:spacing w:after="0"/>
+      </w:pPr>
+      <w:r>
+        <w:t>topic</w:t>
+      </w:r>
+    </w:p>
+    <w:p>
+      <w:pPr>
+        <w:spacing w:after="0"/>
+      </w:pPr>
+      <w:r>
+        <w:t>source</w:t>
+      </w:r>
+    </w:p>
+    <w:p>
+      <w:pPr>
+        <w:spacing w:after="0"/>
+      </w:pPr>
+      <w:r>
+        <w:t>word_count</w:t>
+      </w:r>
+    </w:p>
+    <w:p>
+      <w:pPr>
+        <w:spacing w:after="0"/>
+      </w:pPr>
+      <w:r>
+        <w:t>generation_model</w:t>
+      </w:r>
+    </w:p>
+    <w:p>
+      <w:pPr>
+        <w:spacing w:after="0"/>
+      </w:pPr>
+      <w:r>
+        <w:t>generation_prompt</w:t>
+      </w:r>
+    </w:p>
+    <w:p>
+      <w:pPr>
+        <w:spacing w:after="0"/>
+      </w:pPr>
+      <w:r>
+        <w:lastRenderedPageBreak/>
+        <w:t>essay_id        label          word_count    TTR    burstiness ...</w:t>
+      </w:r>
+    </w:p>
+    <w:p>
+      <w:pPr>
+        <w:spacing w:after="0"/>
+      </w:pPr>
+      <w:r>
+        <w:t>human_001       human          512           .71    0.84</w:t>
+      </w:r>
+    </w:p>
+    <w:p>
+      <w:pPr>
+        <w:spacing w:after="0"/>
+      </w:pPr>
+      <w:r>
+        <w:t>human_002       human          438           .68    1.12</w:t>
+      </w:r>
+    </w:p>
+    <w:p>
+      <w:pPr>
+        <w:spacing w:after="0"/>
+      </w:pPr>
+      <w:r>
+        <w:t>ai_001          ai             497           .54    0.31</w:t>
+      </w:r>
+    </w:p>
+    <w:p>
+      <w:pPr>
+        <w:spacing w:after="0"/>
+      </w:pPr>
+      <w:r>
+        <w:t>ai_002          ai             521           .57    0.28</w:t>
+      </w:r>
+    </w:p>
+    <w:p>
+      <w:pPr>
+        <w:spacing w:after="0"/>
+      </w:pPr>
+      <w:r>
+        <w:t>...</w:t>
+      </w:r>
+    </w:p>
+    <w:p>
+      <w:pPr>
+        <w:spacing w:after="0"/>
+      </w:pPr>
+    </w:p>
+    <w:tbl>
+      <w:tblPr>
+        <w:tblW w:w="0" w:type="auto"/>
+        <w:tblCellSpacing w:w="15" w:type="dxa"/>
+        <w:tblCellMar>
+          <w:top w:w="15" w:type="dxa"/>
+          <w:left w:w="15" w:type="dxa"/>
+          <w:bottom w:w="15" w:type="dxa"/>
+          <w:right w:w="15" w:type="dxa"/>
+        </w:tblCellMar>
+        <w:tblLook w:val="04A0" w:firstRow="1" w:lastRow="0" w:firstColumn="1" w:lastColumn="0" w:noHBand="0" w:noVBand="1"/>
+      </w:tblPr>
+      <w:tblGrid>
+        <w:gridCol w:w="1530"/>
+        <w:gridCol w:w="3693"/>
+        <w:gridCol w:w="2055"/>
+      </w:tblGrid>
+      <w:tr>
+        <w:trPr>
+          <w:tblHeader/>
+          <w:tblCellSpacing w:w="15" w:type="dxa"/>
+        </w:trPr>
+        <w:tc>
+          <w:tcPr>
+            <w:tcW w:w="0" w:type="auto"/>
+            <w:vAlign w:val="center"/>
+            <w:hideMark/>
+          </w:tcPr>
+          <w:p>
+            <w:pPr>
+              <w:spacing w:after="0"/>
+              <w:rPr>
+                <w:b/>
+                <w:bCs/>
+              </w:rPr>
+            </w:pPr>
+            <w:r>
+              <w:rPr>
+                <w:b/>
+                <w:bCs/>
+              </w:rPr>
+              <w:t>Label</w:t>
+            </w:r>
+          </w:p>
+        </w:tc>
+        <w:tc>
+          <w:tcPr>
+            <w:tcW w:w="0" w:type="auto"/>
+            <w:vAlign w:val="center"/>
+            <w:hideMark/>
+          </w:tcPr>
+          <w:p>
+            <w:pPr>
+              <w:spacing w:after="0"/>
+              <w:rPr>
+                <w:b/>
+                <w:bCs/>
+              </w:rPr>
+            </w:pPr>
+            <w:r>
+              <w:rPr>
+                <w:b/>
+                <w:bCs/>
+              </w:rPr>
+              <w:t>What it represents</w:t>
+            </w:r>
+          </w:p>
+        </w:tc>
+        <w:tc>
+          <w:tcPr>
+            <w:tcW w:w="0" w:type="auto"/>
+            <w:vAlign w:val="center"/>
+            <w:hideMark/>
+          </w:tcPr>
+          <w:p>
+            <w:pPr>
+              <w:spacing w:after="0"/>
+              <w:rPr>
+                <w:b/>
+                <w:bCs/>
+              </w:rPr>
+            </w:pPr>
+            <w:r>
+              <w:rPr>
+                <w:b/>
+                <w:bCs/>
+              </w:rPr>
+              <w:t>Purpose</w:t>
+            </w:r>
+          </w:p>
+        </w:tc>
+      </w:tr>
+      <w:tr>
+        <w:trPr>
+          <w:tblCellSpacing w:w="15" w:type="dxa"/>
+        </w:trPr>
+        <w:tc>
+          <w:tcPr>
+            <w:tcW w:w="0" w:type="auto"/>
+            <w:vAlign w:val="center"/>
+            <w:hideMark/>
+          </w:tcPr>
+          <w:p>
+            <w:pPr>
+              <w:spacing w:after="0"/>
+            </w:pPr>
+            <w:r>
+              <w:t>human</w:t>
+            </w:r>
+          </w:p>
+        </w:tc>
+        <w:tc>
+          <w:tcPr>
+            <w:tcW w:w="0" w:type="auto"/>
+            <w:vAlign w:val="center"/>
+            <w:hideMark/>
+          </w:tcPr>
+          <w:p>
+            <w:pPr>
+              <w:spacing w:after="0"/>
+            </w:pPr>
+            <w:r>
+              <w:t>Entirely human-written</w:t>
+            </w:r>
+          </w:p>
+        </w:tc>
+        <w:tc>
+          <w:tcPr>
+            <w:tcW w:w="0" w:type="auto"/>
+            <w:vAlign w:val="center"/>
+            <w:hideMark/>
+          </w:tcPr>
+          <w:p>
+            <w:pPr>
+              <w:spacing w:after="0"/>
+            </w:pPr>
+            <w:r>
+              <w:t>Baseline</w:t>
+            </w:r>
+          </w:p>
+        </w:tc>
+      </w:tr>
+      <w:tr>
+        <w:trPr>
+          <w:tblCellSpacing w:w="15" w:type="dxa"/>
+        </w:trPr>
+        <w:tc>
+          <w:tcPr>
+            <w:tcW w:w="0" w:type="auto"/>
+            <w:vAlign w:val="center"/>
+            <w:hideMark/>
+          </w:tcPr>
+          <w:p>
+            <w:pPr>
+              <w:spacing w:after="0"/>
+            </w:pPr>
+            <w:r>
+              <w:t>ai</w:t>
+            </w:r>
+          </w:p>
+        </w:tc>
+        <w:tc>
+          <w:tcPr>
+            <w:tcW w:w="0" w:type="auto"/>
+            <w:vAlign w:val="center"/>
+            <w:hideMark/>
+          </w:tcPr>
+          <w:p>
+            <w:pPr>
+              <w:spacing w:after="0"/>
+            </w:pPr>
+            <w:r>
+              <w:t>Entirely AI-generated</w:t>
+            </w:r>
+          </w:p>
+        </w:tc>
+        <w:tc>
+          <w:tcPr>
+            <w:tcW w:w="0" w:type="auto"/>
+            <w:vAlign w:val="center"/>
+            <w:hideMark/>
+          </w:tcPr>
+          <w:p>
+            <w:pPr>
+              <w:spacing w:after="0"/>
+            </w:pPr>
+            <w:r>
+              <w:t>AI baseline</w:t>
+            </w:r>
+          </w:p>
+        </w:tc>
+      </w:tr>
+      <w:tr>
+        <w:trPr>
+          <w:tblCellSpacing w:w="15" w:type="dxa"/>
+        </w:trPr>
+        <w:tc>
+          <w:tcPr>
+            <w:tcW w:w="0" w:type="auto"/>
+            <w:vAlign w:val="center"/>
+            <w:hideMark/>
+          </w:tcPr>
+          <w:p>
+            <w:pPr>
+              <w:spacing w:after="0"/>
+            </w:pPr>
+            <w:r>
+              <w:t>ai_polished</w:t>
+            </w:r>
+          </w:p>
+        </w:tc>
+        <w:tc>
+          <w:tcPr>
+            <w:tcW w:w="0" w:type="auto"/>
+            <w:vAlign w:val="center"/>
+            <w:hideMark/>
+          </w:tcPr>
+          <w:p>
+            <w:pPr>
+              <w:spacing w:after="0"/>
+            </w:pPr>
+            <w:r>
+              <w:t>Human text modified by AI</w:t>
+            </w:r>
+          </w:p>
+        </w:tc>
+        <w:tc>
+          <w:tcPr>
+            <w:tcW w:w="0" w:type="auto"/>
+            <w:vAlign w:val="center"/>
+            <w:hideMark/>
+          </w:tcPr>
+          <w:p>
+            <w:pPr>
+              <w:spacing w:after="0"/>
+            </w:pPr>
+            <w:r>
+              <w:t>Real-world detection</w:t>
+            </w:r>
+          </w:p>
+        </w:tc>
+      </w:tr>
+      <w:tr>
+        <w:trPr>
+          <w:tblCellSpacing w:w="15" w:type="dxa"/>
+        </w:trPr>
+        <w:tc>
+          <w:tcPr>
+            <w:tcW w:w="0" w:type="auto"/>
+            <w:vAlign w:val="center"/>
+            <w:hideMark/>
+          </w:tcPr>
+          <w:p>
+            <w:pPr>
+              <w:spacing w:after="0"/>
+            </w:pPr>
+            <w:r>
+              <w:t>human_revised</w:t>
+            </w:r>
+          </w:p>
+        </w:tc>
+        <w:tc>
+          <w:tcPr>
+            <w:tcW w:w="0" w:type="auto"/>
+            <w:vAlign w:val="center"/>
+            <w:hideMark/>
+          </w:tcPr>
+          <w:p>
+            <w:pPr>
+              <w:spacing w:after="0"/>
+            </w:pPr>
+            <w:r>
+              <w:t>Human text edited/revised by a person</w:t>
+            </w:r>
+          </w:p>
+        </w:tc>
+        <w:tc>
+          <w:tcPr>
+            <w:tcW w:w="0" w:type="auto"/>
+            <w:vAlign w:val="center"/>
+            <w:hideMark/>
+          </w:tcPr>
+          <w:p>
+            <w:pPr>
+              <w:spacing w:after="0"/>
+            </w:pPr>
+            <w:r>
+              <w:t>Important control</w:t>
+            </w:r>
+          </w:p>
+        </w:tc>
+      </w:tr>
+    </w:tbl>
+    <w:p>
+      <w:pPr>
+        <w:spacing w:after="0"/>
+      </w:pPr>
+    </w:p>
+    <w:p>
+      <w:pPr>
+        <w:spacing w:after="0"/>
+      </w:pPr>
+    </w:p>
+    <w:p>
+      <w:pPr>
+        <w:spacing w:after="0"/>
+      </w:pPr>
+      <w:r>
+        <w:t>MODEL</w:t>
+      </w:r>
+    </w:p>
+    <w:p>
+      <w:pPr>
+        <w:spacing w:after="0"/>
+      </w:pPr>
+      <w:r>
+        <w:t xml:space="preserve"> </w:t>
+      </w:r>
+      <w:r>
+        <w:rPr>
+          <w:rFonts w:ascii="MS Gothic" w:eastAsia="MS Gothic" w:hAnsi="MS Gothic" w:cs="MS Gothic" w:hint="eastAsia"/>
+        </w:rPr>
+        <w:t>├</w:t>
+      </w:r>
+      <w:r>
+        <w:rPr>
+          <w:rFonts w:ascii="Aptos" w:hAnsi="Aptos" w:cs="Aptos"/>
+        </w:rPr>
+        <w:t>──</w:t>
+      </w:r>
+      <w:r>
+        <w:t xml:space="preserve"> Model A</w:t>
+      </w:r>
+    </w:p>
+    <w:p>
+      <w:pPr>
+        <w:spacing w:after="0"/>
+      </w:pPr>
+      <w:r>
+        <w:t xml:space="preserve"> </w:t>
+      </w:r>
+      <w:r>
+        <w:rPr>
+          <w:rFonts w:ascii="MS Gothic" w:eastAsia="MS Gothic" w:hAnsi="MS Gothic" w:cs="MS Gothic" w:hint="eastAsia"/>
+        </w:rPr>
+        <w:t>├</w:t>
+      </w:r>
+      <w:r>
+        <w:rPr>
+          <w:rFonts w:ascii="Aptos" w:hAnsi="Aptos" w:cs="Aptos"/>
+        </w:rPr>
+        <w:t>──</w:t>
+      </w:r>
+      <w:r>
+        <w:t xml:space="preserve"> Model B</w:t>
+      </w:r>
+    </w:p>
+    <w:p>
+      <w:pPr>
+        <w:spacing w:after="0"/>
+      </w:pPr>
+      <w:r>
+        <w:t xml:space="preserve"> </w:t>
+      </w:r>
+      <w:r>
+        <w:rPr>
+          <w:rFonts w:ascii="MS Gothic" w:eastAsia="MS Gothic" w:hAnsi="MS Gothic" w:cs="MS Gothic" w:hint="eastAsia"/>
+        </w:rPr>
+        <w:t>├</w:t>
+      </w:r>
+      <w:r>
+        <w:rPr>
+          <w:rFonts w:ascii="Aptos" w:hAnsi="Aptos" w:cs="Aptos"/>
+        </w:rPr>
+        <w:t>──</w:t>
+      </w:r>
+      <w:r>
+        <w:t xml:space="preserve"> Model C</w:t>
+      </w:r>
+    </w:p>
+    <w:p>
+      <w:pPr>
+        <w:spacing w:after="0"/>
+      </w:pPr>
+      <w:r>
+        <w:t xml:space="preserve"> └── Model D</w:t>
+      </w:r>
+    </w:p>
+    <w:p>
+      <w:pPr>
+        <w:spacing w:after="0"/>
+      </w:pPr>
+    </w:p>
+    <w:p>
+      <w:pPr>
+        <w:spacing w:after="0"/>
+      </w:pPr>
+      <w:r>
+        <w:t>TOPIC</w:t>
+      </w:r>
+    </w:p>
+    <w:p>
+      <w:pPr>
+        <w:spacing w:after="0"/>
+      </w:pPr>
+      <w:r>
+        <w:t xml:space="preserve"> </w:t>
+      </w:r>
+      <w:r>
+        <w:rPr>
+          <w:rFonts w:ascii="MS Gothic" w:eastAsia="MS Gothic" w:hAnsi="MS Gothic" w:cs="MS Gothic" w:hint="eastAsia"/>
+        </w:rPr>
+        <w:t>├</w:t>
+      </w:r>
+      <w:r>
+        <w:rPr>
+          <w:rFonts w:ascii="Aptos" w:hAnsi="Aptos" w:cs="Aptos"/>
+        </w:rPr>
+        <w:t>──</w:t>
+      </w:r>
+      <w:r>
+        <w:t xml:space="preserve"> education</w:t>
+      </w:r>
+    </w:p>
+    <w:p>
+      <w:pPr>
+        <w:spacing w:after="0"/>
+      </w:pPr>
+      <w:r>
+        <w:t xml:space="preserve"> </w:t>
+      </w:r>
+      <w:r>
+        <w:rPr>
+          <w:rFonts w:ascii="MS Gothic" w:eastAsia="MS Gothic" w:hAnsi="MS Gothic" w:cs="MS Gothic" w:hint="eastAsia"/>
+        </w:rPr>
+        <w:t>├</w:t>
+      </w:r>
+      <w:r>
+        <w:rPr>
+          <w:rFonts w:ascii="Aptos" w:hAnsi="Aptos" w:cs="Aptos"/>
+        </w:rPr>
+        <w:t>──</w:t>
+      </w:r>
+      <w:r>
+        <w:t xml:space="preserve"> technology</w:t>
+      </w:r>
+    </w:p>
+    <w:p>
+      <w:pPr>
+        <w:spacing w:after="0"/>
+      </w:pPr>
+      <w:r>
+        <w:t xml:space="preserve"> </w:t>
+      </w:r>
+      <w:r>
+        <w:rPr>
+          <w:rFonts w:ascii="MS Gothic" w:eastAsia="MS Gothic" w:hAnsi="MS Gothic" w:cs="MS Gothic" w:hint="eastAsia"/>
+        </w:rPr>
+        <w:t>├</w:t>
+      </w:r>
+      <w:r>
+        <w:rPr>
+          <w:rFonts w:ascii="Aptos" w:hAnsi="Aptos" w:cs="Aptos"/>
+        </w:rPr>
+        <w:t>──</w:t>
+      </w:r>
+      <w:r>
+        <w:t xml:space="preserve"> family</w:t>
+      </w:r>
+    </w:p>
+    <w:p>
+      <w:pPr>
+        <w:spacing w:after="0"/>
+      </w:pPr>
+      <w:r>
+        <w:t xml:space="preserve"> </w:t>
+      </w:r>
+      <w:r>
+        <w:rPr>
+          <w:rFonts w:ascii="MS Gothic" w:eastAsia="MS Gothic" w:hAnsi="MS Gothic" w:cs="MS Gothic" w:hint="eastAsia"/>
+        </w:rPr>
+        <w:t>├</w:t>
+      </w:r>
+      <w:r>
+        <w:rPr>
+          <w:rFonts w:ascii="Aptos" w:hAnsi="Aptos" w:cs="Aptos"/>
+        </w:rPr>
+        <w:t>──</w:t>
+      </w:r>
+      <w:r>
+        <w:t xml:space="preserve"> leadership</w:t>
+      </w:r>
+    </w:p>
+    <w:p>
+      <w:pPr>
+        <w:spacing w:after="0"/>
+      </w:pPr>
+      <w:r>
+        <w:t xml:space="preserve"> </w:t>
+      </w:r>
+      <w:r>
+        <w:rPr>
+          <w:rFonts w:ascii="MS Gothic" w:eastAsia="MS Gothic" w:hAnsi="MS Gothic" w:cs="MS Gothic" w:hint="eastAsia"/>
+        </w:rPr>
+        <w:t>├</w:t>
+      </w:r>
+      <w:r>
+        <w:rPr>
+          <w:rFonts w:ascii="Aptos" w:hAnsi="Aptos" w:cs="Aptos"/>
+        </w:rPr>
+        <w:t>──</w:t>
+      </w:r>
+      <w:r>
+        <w:t xml:space="preserve"> failure</w:t>
+      </w:r>
+    </w:p>
+    <w:p>
+      <w:pPr>
+        <w:spacing w:after="0"/>
+      </w:pPr>
+      <w:r>
+        <w:t xml:space="preserve"> </w:t>
+      </w:r>
+      <w:r>
+        <w:rPr>
+          <w:rFonts w:ascii="MS Gothic" w:eastAsia="MS Gothic" w:hAnsi="MS Gothic" w:cs="MS Gothic" w:hint="eastAsia"/>
+        </w:rPr>
+        <w:t>├</w:t>
+      </w:r>
+      <w:r>
+        <w:rPr>
+          <w:rFonts w:ascii="Aptos" w:hAnsi="Aptos" w:cs="Aptos"/>
+        </w:rPr>
+        <w:t>──</w:t>
+      </w:r>
+      <w:r>
+        <w:t xml:space="preserve"> community</w:t>
+      </w:r>
+    </w:p>
+    <w:p>
+      <w:pPr>
+        <w:spacing w:after="0"/>
+      </w:pPr>
+      <w:r>
+        <w:t xml:space="preserve"> └── personal growth</w:t>
+      </w:r>
+    </w:p>
+    <w:p>
+      <w:pPr>
+        <w:spacing w:after="0"/>
+      </w:pPr>
+    </w:p>
+    <w:p>
+      <w:pPr>
+        <w:spacing w:after="0"/>
+      </w:pPr>
+      <w:r>
+        <w:t>STYLE</w:t>
+      </w:r>
+    </w:p>
+    <w:p>
+      <w:pPr>
+        <w:spacing w:after="0"/>
+      </w:pPr>
+      <w:r>
+        <w:t xml:space="preserve"> </w:t>
+      </w:r>
+      <w:r>
+        <w:rPr>
+          <w:rFonts w:ascii="MS Gothic" w:eastAsia="MS Gothic" w:hAnsi="MS Gothic" w:cs="MS Gothic" w:hint="eastAsia"/>
+        </w:rPr>
+        <w:t>├</w:t>
+      </w:r>
+      <w:r>
+        <w:rPr>
+          <w:rFonts w:ascii="Aptos" w:hAnsi="Aptos" w:cs="Aptos"/>
+        </w:rPr>
+        <w:t>──</w:t>
+      </w:r>
+      <w:r>
+        <w:t xml:space="preserve"> straightforward</w:t>
+      </w:r>
+    </w:p>
+    <w:p>
+      <w:pPr>
+        <w:spacing w:after="0"/>
+      </w:pPr>
+      <w:r>
+        <w:t xml:space="preserve"> </w:t>
+      </w:r>
+      <w:r>
+        <w:rPr>
+          <w:rFonts w:ascii="MS Gothic" w:eastAsia="MS Gothic" w:hAnsi="MS Gothic" w:cs="MS Gothic" w:hint="eastAsia"/>
+        </w:rPr>
+        <w:t>├</w:t>
+      </w:r>
+      <w:r>
+        <w:rPr>
+          <w:rFonts w:ascii="Aptos" w:hAnsi="Aptos" w:cs="Aptos"/>
+        </w:rPr>
+        <w:t>──</w:t>
+      </w:r>
+      <w:r>
+        <w:t xml:space="preserve"> reflective</w:t>
+      </w:r>
+    </w:p>
+    <w:p>
+      <w:pPr>
+        <w:spacing w:after="0"/>
+      </w:pPr>
+      <w:r>
+        <w:t xml:space="preserve"> </w:t>
+      </w:r>
+      <w:r>
+        <w:rPr>
+          <w:rFonts w:ascii="MS Gothic" w:eastAsia="MS Gothic" w:hAnsi="MS Gothic" w:cs="MS Gothic" w:hint="eastAsia"/>
+        </w:rPr>
+        <w:t>├</w:t>
+      </w:r>
+      <w:r>
+        <w:rPr>
+          <w:rFonts w:ascii="Aptos" w:hAnsi="Aptos" w:cs="Aptos"/>
+        </w:rPr>
+        <w:t>──</w:t>
+      </w:r>
+      <w:r>
+        <w:t xml:space="preserve"> formal</w:t>
+      </w:r>
+    </w:p>
+    <w:p>
+      <w:pPr>
+        <w:spacing w:after="0"/>
+      </w:pPr>
+      <w:r>
+        <w:t xml:space="preserve"> └── conversational</w:t>
+      </w:r>
+    </w:p>
+    <w:p>
+      <w:pPr>
+        <w:spacing w:after="0"/>
+      </w:pPr>
+    </w:p>
+    <w:p>
+      <w:pPr>
+        <w:spacing w:after="0"/>
+      </w:pPr>
+      <w:r>
+        <w:t>LENGTH</w:t>
+      </w:r>
+    </w:p>
+    <w:p>
+      <w:pPr>
+        <w:spacing w:after="0"/>
+      </w:pPr>
+      <w:r>
+        <w:t xml:space="preserve"> </w:t>
+      </w:r>
+      <w:r>
+        <w:rPr>
+          <w:rFonts w:ascii="MS Gothic" w:eastAsia="MS Gothic" w:hAnsi="MS Gothic" w:cs="MS Gothic" w:hint="eastAsia"/>
+        </w:rPr>
+        <w:t>├</w:t>
+      </w:r>
+      <w:r>
+        <w:rPr>
+          <w:rFonts w:ascii="Aptos" w:hAnsi="Aptos" w:cs="Aptos"/>
+        </w:rPr>
+        <w:t>──</w:t>
+      </w:r>
+      <w:r>
+        <w:t xml:space="preserve"> short</w:t>
+      </w:r>
+    </w:p>
+    <w:p>
+      <w:pPr>
+        <w:spacing w:after="0"/>
+      </w:pPr>
+      <w:r>
+        <w:t xml:space="preserve"> </w:t>
+      </w:r>
+      <w:r>
+        <w:rPr>
+          <w:rFonts w:ascii="MS Gothic" w:eastAsia="MS Gothic" w:hAnsi="MS Gothic" w:cs="MS Gothic" w:hint="eastAsia"/>
+        </w:rPr>
+        <w:t>├</w:t>
+      </w:r>
+      <w:r>
+        <w:rPr>
+          <w:rFonts w:ascii="Aptos" w:hAnsi="Aptos" w:cs="Aptos"/>
+        </w:rPr>
+        <w:t>──</w:t>
+      </w:r>
+      <w:r>
+        <w:t xml:space="preserve"> medium</w:t>
+      </w:r>
+    </w:p>
+    <w:p>
+      <w:pPr>
+        <w:spacing w:after="0"/>
+      </w:pPr>
+      <w:r>
+        <w:t xml:space="preserve"> └── long</w:t>
+      </w:r>
+    </w:p>
+    <w:p>
+      <w:pPr>
+        <w:spacing w:after="0"/>
+      </w:pPr>
+    </w:p>
+    <w:p>
+      <w:pPr>
+        <w:spacing w:after="0"/>
+      </w:pPr>
+      <w:r>
+        <w:t>MODEL</w:t>
+      </w:r>
+    </w:p>
+    <w:p>
+      <w:pPr>
+        <w:spacing w:after="0"/>
+      </w:pPr>
+      <w:r>
+        <w:t xml:space="preserve"> </w:t>
+      </w:r>
+      <w:r>
+        <w:rPr>
+          <w:rFonts w:ascii="MS Gothic" w:eastAsia="MS Gothic" w:hAnsi="MS Gothic" w:cs="MS Gothic" w:hint="eastAsia"/>
+        </w:rPr>
+        <w:t>├</w:t>
+      </w:r>
+      <w:r>
+        <w:rPr>
+          <w:rFonts w:ascii="Aptos" w:hAnsi="Aptos" w:cs="Aptos"/>
+        </w:rPr>
+        <w:t>──</w:t>
+      </w:r>
+      <w:r>
+        <w:t xml:space="preserve"> Model A</w:t>
+      </w:r>
+    </w:p>
+    <w:p>
+      <w:pPr>
+        <w:spacing w:after="0"/>
+      </w:pPr>
+      <w:r>
+        <w:t xml:space="preserve"> </w:t>
+      </w:r>
+      <w:r>
+        <w:rPr>
+          <w:rFonts w:ascii="MS Gothic" w:eastAsia="MS Gothic" w:hAnsi="MS Gothic" w:cs="MS Gothic" w:hint="eastAsia"/>
+        </w:rPr>
+        <w:t>├</w:t>
+      </w:r>
+      <w:r>
+        <w:rPr>
+          <w:rFonts w:ascii="Aptos" w:hAnsi="Aptos" w:cs="Aptos"/>
+        </w:rPr>
+        <w:t>──</w:t>
+      </w:r>
+      <w:r>
+        <w:t xml:space="preserve"> Model B</w:t>
+      </w:r>
+    </w:p>
+    <w:p>
+      <w:pPr>
+        <w:spacing w:after="0"/>
+      </w:pPr>
+      <w:r>
+        <w:t xml:space="preserve"> </w:t>
+      </w:r>
+      <w:r>
+        <w:rPr>
+          <w:rFonts w:ascii="MS Gothic" w:eastAsia="MS Gothic" w:hAnsi="MS Gothic" w:cs="MS Gothic" w:hint="eastAsia"/>
+        </w:rPr>
+        <w:t>├</w:t>
+      </w:r>
+      <w:r>
+        <w:rPr>
+          <w:rFonts w:ascii="Aptos" w:hAnsi="Aptos" w:cs="Aptos"/>
+        </w:rPr>
+        <w:t>──</w:t>
+      </w:r>
+      <w:r>
+        <w:t xml:space="preserve"> Model C</w:t>
+      </w:r>
+    </w:p>
+    <w:p>
+      <w:pPr>
+        <w:spacing w:after="0"/>
+      </w:pPr>
+      <w:r>
+        <w:t xml:space="preserve"> └── Model D</w:t>
+      </w:r>
+    </w:p>
+    <w:p>
+      <w:pPr>
+        <w:spacing w:after="0"/>
+      </w:pPr>
+    </w:p>
+    <w:p>
+      <w:pPr>
+        <w:spacing w:after="0"/>
+      </w:pPr>
+      <w:r>
+        <w:lastRenderedPageBreak/>
+        <w:t>TOPIC</w:t>
+      </w:r>
+    </w:p>
+    <w:p>
+      <w:pPr>
+        <w:spacing w:after="0"/>
+      </w:pPr>
+      <w:r>
+        <w:t xml:space="preserve"> </w:t>
+      </w:r>
+      <w:r>
+        <w:rPr>
+          <w:rFonts w:ascii="MS Gothic" w:eastAsia="MS Gothic" w:hAnsi="MS Gothic" w:cs="MS Gothic" w:hint="eastAsia"/>
+        </w:rPr>
+        <w:t>├</w:t>
+      </w:r>
+      <w:r>
+        <w:rPr>
+          <w:rFonts w:ascii="Aptos" w:hAnsi="Aptos" w:cs="Aptos"/>
+        </w:rPr>
+        <w:t>──</w:t>
+      </w:r>
+      <w:r>
+        <w:t xml:space="preserve"> education</w:t>
+      </w:r>
+    </w:p>
+    <w:p>
+      <w:pPr>
+        <w:spacing w:after="0"/>
+      </w:pPr>
+      <w:r>
+        <w:t xml:space="preserve"> </w:t>
+      </w:r>
+      <w:r>
+        <w:rPr>
+          <w:rFonts w:ascii="MS Gothic" w:eastAsia="MS Gothic" w:hAnsi="MS Gothic" w:cs="MS Gothic" w:hint="eastAsia"/>
+        </w:rPr>
+        <w:t>├</w:t>
+      </w:r>
+      <w:r>
+        <w:rPr>
+          <w:rFonts w:ascii="Aptos" w:hAnsi="Aptos" w:cs="Aptos"/>
+        </w:rPr>
+        <w:t>──</w:t>
+      </w:r>
+      <w:r>
+        <w:t xml:space="preserve"> technology</w:t>
+      </w:r>
+    </w:p>
+    <w:p>
+      <w:pPr>
+        <w:spacing w:after="0"/>
+      </w:pPr>
+      <w:r>
+        <w:t xml:space="preserve"> </w:t>
+      </w:r>
+      <w:r>
+        <w:rPr>
+          <w:rFonts w:ascii="MS Gothic" w:eastAsia="MS Gothic" w:hAnsi="MS Gothic" w:cs="MS Gothic" w:hint="eastAsia"/>
+        </w:rPr>
+        <w:t>├</w:t>
+      </w:r>
+      <w:r>
+        <w:rPr>
+          <w:rFonts w:ascii="Aptos" w:hAnsi="Aptos" w:cs="Aptos"/>
+        </w:rPr>
+        <w:t>──</w:t>
+      </w:r>
+      <w:r>
+        <w:t xml:space="preserve"> family</w:t>
+      </w:r>
+    </w:p>
+    <w:p>
+      <w:pPr>
+        <w:spacing w:after="0"/>
+      </w:pPr>
+      <w:r>
+        <w:t xml:space="preserve"> </w:t>
+      </w:r>
+      <w:r>
+        <w:rPr>
+          <w:rFonts w:ascii="MS Gothic" w:eastAsia="MS Gothic" w:hAnsi="MS Gothic" w:cs="MS Gothic" w:hint="eastAsia"/>
+        </w:rPr>
+        <w:t>├</w:t>
+      </w:r>
+      <w:r>
+        <w:rPr>
+          <w:rFonts w:ascii="Aptos" w:hAnsi="Aptos" w:cs="Aptos"/>
+        </w:rPr>
+        <w:t>──</w:t>
+      </w:r>
+      <w:r>
+        <w:t xml:space="preserve"> leadership</w:t>
+      </w:r>
+    </w:p>
+    <w:p>
+      <w:pPr>
+        <w:spacing w:after="0"/>
+      </w:pPr>
+      <w:r>
+        <w:t xml:space="preserve"> </w:t>
+      </w:r>
+      <w:r>
+        <w:rPr>
+          <w:rFonts w:ascii="MS Gothic" w:eastAsia="MS Gothic" w:hAnsi="MS Gothic" w:cs="MS Gothic" w:hint="eastAsia"/>
+        </w:rPr>
+        <w:t>├</w:t>
+      </w:r>
+      <w:r>
+        <w:rPr>
+          <w:rFonts w:ascii="Aptos" w:hAnsi="Aptos" w:cs="Aptos"/>
+        </w:rPr>
+        <w:t>──</w:t>
+      </w:r>
+      <w:r>
+        <w:t xml:space="preserve"> failure</w:t>
+      </w:r>
+    </w:p>
+    <w:p>
+      <w:pPr>
+        <w:spacing w:after="0"/>
+      </w:pPr>
+      <w:r>
+        <w:t xml:space="preserve"> </w:t>
+      </w:r>
+      <w:r>
+        <w:rPr>
+          <w:rFonts w:ascii="MS Gothic" w:eastAsia="MS Gothic" w:hAnsi="MS Gothic" w:cs="MS Gothic" w:hint="eastAsia"/>
+        </w:rPr>
+        <w:t>├</w:t>
+      </w:r>
+      <w:r>
+        <w:rPr>
+          <w:rFonts w:ascii="Aptos" w:hAnsi="Aptos" w:cs="Aptos"/>
+        </w:rPr>
+        <w:t>──</w:t>
+      </w:r>
+      <w:r>
+        <w:t xml:space="preserve"> community</w:t>
+      </w:r>
+    </w:p>
+    <w:p>
+      <w:pPr>
+        <w:spacing w:after="0"/>
+      </w:pPr>
+      <w:r>
+        <w:t xml:space="preserve"> └── personal growth</w:t>
+      </w:r>
+    </w:p>
+    <w:p>
+      <w:pPr>
+        <w:spacing w:after="0"/>
+      </w:pPr>
+    </w:p>
+    <w:p>
+      <w:pPr>
+        <w:spacing w:after="0"/>
+      </w:pPr>
+      <w:r>
+        <w:t>STYLE</w:t>
+      </w:r>
+    </w:p>
+    <w:p>
+      <w:pPr>
+        <w:spacing w:after="0"/>
+      </w:pPr>
+      <w:r>
+        <w:t xml:space="preserve"> </w:t>
+      </w:r>
+      <w:r>
+        <w:rPr>
+          <w:rFonts w:ascii="MS Gothic" w:eastAsia="MS Gothic" w:hAnsi="MS Gothic" w:cs="MS Gothic" w:hint="eastAsia"/>
+        </w:rPr>
+        <w:t>├</w:t>
+      </w:r>
+      <w:r>
+        <w:rPr>
+          <w:rFonts w:ascii="Aptos" w:hAnsi="Aptos" w:cs="Aptos"/>
+        </w:rPr>
+        <w:t>──</w:t>
+      </w:r>
+      <w:r>
+        <w:t xml:space="preserve"> straightforward</w:t>
+      </w:r>
+    </w:p>
+    <w:p>
+      <w:pPr>
+        <w:spacing w:after="0"/>
+      </w:pPr>
+      <w:r>
+        <w:t xml:space="preserve"> </w:t>
+      </w:r>
+      <w:r>
+        <w:rPr>
+          <w:rFonts w:ascii="MS Gothic" w:eastAsia="MS Gothic" w:hAnsi="MS Gothic" w:cs="MS Gothic" w:hint="eastAsia"/>
+        </w:rPr>
+        <w:t>├</w:t>
+      </w:r>
+      <w:r>
+        <w:rPr>
+          <w:rFonts w:ascii="Aptos" w:hAnsi="Aptos" w:cs="Aptos"/>
+        </w:rPr>
+        <w:t>──</w:t>
+      </w:r>
+      <w:r>
+        <w:t xml:space="preserve"> reflective</w:t>
+      </w:r>
+    </w:p>
+    <w:p>
+      <w:pPr>
+        <w:spacing w:after="0"/>
+      </w:pPr>
+      <w:r>
+        <w:t xml:space="preserve"> </w:t>
+      </w:r>
+      <w:r>
+        <w:rPr>
+          <w:rFonts w:ascii="MS Gothic" w:eastAsia="MS Gothic" w:hAnsi="MS Gothic" w:cs="MS Gothic" w:hint="eastAsia"/>
+        </w:rPr>
+        <w:t>├</w:t>
+      </w:r>
+      <w:r>
+        <w:rPr>
+          <w:rFonts w:ascii="Aptos" w:hAnsi="Aptos" w:cs="Aptos"/>
+        </w:rPr>
+        <w:t>──</w:t>
+      </w:r>
+      <w:r>
+        <w:t xml:space="preserve"> formal</w:t>
+      </w:r>
+    </w:p>
+    <w:p>
+      <w:pPr>
+        <w:spacing w:after="0"/>
+      </w:pPr>
+      <w:r>
+        <w:t xml:space="preserve"> └── conversational</w:t>
+      </w:r>
+    </w:p>
+    <w:p>
+      <w:pPr>
+        <w:spacing w:after="0"/>
+      </w:pPr>
+    </w:p>
+    <w:p>
+      <w:pPr>
+        <w:spacing w:after="0"/>
+      </w:pPr>
+      <w:r>
+        <w:t>LENGTH</w:t>
+      </w:r>
+    </w:p>
+    <w:p>
+      <w:pPr>
+        <w:spacing w:after="0"/>
+      </w:pPr>
+      <w:r>
+        <w:t xml:space="preserve"> </w:t>
+      </w:r>
+      <w:r>
+        <w:rPr>
+          <w:rFonts w:ascii="MS Gothic" w:eastAsia="MS Gothic" w:hAnsi="MS Gothic" w:cs="MS Gothic" w:hint="eastAsia"/>
+        </w:rPr>
+        <w:t>├</w:t>
+      </w:r>
+      <w:r>
+        <w:rPr>
+          <w:rFonts w:ascii="Aptos" w:hAnsi="Aptos" w:cs="Aptos"/>
+        </w:rPr>
+        <w:t>──</w:t>
+      </w:r>
+      <w:r>
+        <w:t xml:space="preserve"> short</w:t>
+      </w:r>
+    </w:p>
+    <w:p>
+      <w:pPr>
+        <w:spacing w:after="0"/>
+      </w:pPr>
+      <w:r>
+        <w:t xml:space="preserve"> </w:t>
+      </w:r>
+      <w:r>
+        <w:rPr>
+          <w:rFonts w:ascii="MS Gothic" w:eastAsia="MS Gothic" w:hAnsi="MS Gothic" w:cs="MS Gothic" w:hint="eastAsia"/>
+        </w:rPr>
+        <w:t>├</w:t>
+      </w:r>
+      <w:r>
+        <w:rPr>
+          <w:rFonts w:ascii="Aptos" w:hAnsi="Aptos" w:cs="Aptos"/>
+        </w:rPr>
+        <w:t>──</w:t>
+      </w:r>
+      <w:r>
+        <w:t xml:space="preserve"> medium</w:t>
+      </w:r>
+    </w:p>
+    <w:p>
+      <w:pPr>
+        <w:spacing w:after="0"/>
+      </w:pPr>
+      <w:r>
+        <w:t xml:space="preserve"> └── long</w:t>
+      </w:r>
+    </w:p>
+    <w:p>
+      <w:pPr>
+        <w:spacing w:after="0"/>
+      </w:pPr>
+    </w:p>
+    <w:p>
+      <w:pPr>
+        <w:spacing w:after="0"/>
+        <w:jc w:val="center"/>
+      </w:pPr>
+    </w:p>
+    <w:p>
+      <w:pPr>
+        <w:spacing w:after="0"/>
+        <w:jc w:val="center"/>
+      </w:pPr>
+      <w:r>
+        <w:t>HUMANTRACE DATASET</w:t>
+      </w:r>
+    </w:p>
+    <w:p>
+      <w:pPr>
+        <w:spacing w:after="0"/>
+        <w:jc w:val="center"/>
+      </w:pPr>
+    </w:p>
+    <w:p>
+      <w:pPr>
+        <w:spacing w:after="0"/>
+        <w:jc w:val="center"/>
+      </w:pPr>
+      <w:r>
+        <w:t>Human Essays</w:t>
+      </w:r>
+    </w:p>
+    <w:p>
+      <w:pPr>
+        <w:spacing w:after="0"/>
+        <w:jc w:val="center"/>
+      </w:pPr>
+      <w:r>
+        <w:t>│</w:t>
+      </w:r>
+    </w:p>
+    <w:p>
+      <w:pPr>
+        <w:spacing w:after="0"/>
+        <w:jc w:val="center"/>
+      </w:pPr>
+      <w:r>
+        <w:t>┌────────────────────</w:t>
+      </w:r>
+      <w:r>
+        <w:rPr>
+          <w:rFonts w:ascii="MS Gothic" w:eastAsia="MS Gothic" w:hAnsi="MS Gothic" w:cs="MS Gothic" w:hint="eastAsia"/>
+        </w:rPr>
+        <w:t>┼</w:t>
+      </w:r>
+      <w:r>
+        <w:rPr>
+          <w:rFonts w:ascii="Aptos" w:hAnsi="Aptos" w:cs="Aptos"/>
+        </w:rPr>
+        <w:t>────────────────────┐</w:t>
+      </w:r>
+    </w:p>
+    <w:p>
+      <w:pPr>
+        <w:spacing w:after="0"/>
+        <w:jc w:val="center"/>
+      </w:pPr>
+      <w:r>
+        <w:t>College essays       Personal essays     Public essays</w:t>
+      </w:r>
+    </w:p>
+    <w:p>
+      <w:pPr>
+        <w:spacing w:after="0"/>
+        <w:jc w:val="center"/>
+      </w:pPr>
+    </w:p>
+    <w:p>
+      <w:pPr>
+        <w:spacing w:after="0"/>
+        <w:jc w:val="center"/>
+      </w:pPr>
+      <w:r>
+        <w:t>│</w:t>
+      </w:r>
+    </w:p>
+    <w:p>
+      <w:pPr>
+        <w:spacing w:after="0"/>
+        <w:jc w:val="center"/>
+      </w:pPr>
+      <w:r>
+        <w:t>Controlled AI versions</w:t>
+      </w:r>
+    </w:p>
+    <w:p>
+      <w:pPr>
+        <w:spacing w:after="0"/>
+        <w:jc w:val="center"/>
+      </w:pPr>
+    </w:p>
+    <w:p>
+      <w:pPr>
+        <w:spacing w:after="0"/>
+        <w:jc w:val="center"/>
+      </w:pPr>
+      <w:r>
+        <w:t>│</w:t>
+      </w:r>
+    </w:p>
+    <w:p>
+      <w:pPr>
+        <w:spacing w:after="0"/>
+        <w:jc w:val="center"/>
+      </w:pPr>
+      <w:r>
+        <w:t>┌────────────────────</w:t>
+      </w:r>
+      <w:r>
+        <w:rPr>
+          <w:rFonts w:ascii="MS Gothic" w:eastAsia="MS Gothic" w:hAnsi="MS Gothic" w:cs="MS Gothic" w:hint="eastAsia"/>
+        </w:rPr>
+        <w:t>┼</w:t>
+      </w:r>
+      <w:r>
+        <w:rPr>
+          <w:rFonts w:ascii="Aptos" w:hAnsi="Aptos" w:cs="Aptos"/>
+        </w:rPr>
+        <w:t>────────────────────┐</w:t>
+      </w:r>
+    </w:p>
+    <w:p>
+      <w:pPr>
+        <w:spacing w:after="0"/>
+        <w:jc w:val="center"/>
+      </w:pPr>
+      <w:r>
+        <w:t>AI              AI-polished        Human revised</w:t>
+      </w:r>
     </w:p>
     <w:sectPr>
       <w:pgSz w:w="11906" w:h="16838"/>
@@ -4795,6 +6114,10 @@
     </w:sectPr>
   </w:body>
 </w:document>
+</file>
+
+<file path=word/numbering.xml><?xml version="1.0" encoding="utf-8"?>
+<w:numbering xmlns:wpc="http://schemas.microsoft.com/office/word/2010/wordprocessingCanvas" xmlns:cx="http://schemas.microsoft.com/office/drawing/2014/chartex" xmlns:cx1="http://schemas.microsoft.com/office/drawing/2015/9/8/chartex" xmlns:cx2="http://schemas.microsoft.com/office/drawing/2015/10/21/chartex" xmlns:cx3="http://schemas.microsoft.com/office/drawing/2016/5/9/chartex" xmlns:cx4="http://schemas.microsoft.com/office/drawing/2016/5/10/chartex" xmlns:cx5="http://schemas.microsoft.com/office/drawing/2016/5/11/chartex" xmlns:cx6="http://schemas.microsoft.com/office/drawing/2016/5/12/chartex" xmlns:cx7="http://schemas.microsoft.com/office/drawing/2016/5/13/chartex" xmlns:cx8="http://schemas.microsoft.com/office/drawing/2016/5/14/chartex" xmlns:mc="http://schemas.openxmlformats.org/markup-compatibility/2006" xmlns:aink="http://schemas.microsoft.com/office/drawing/2016/ink" xmlns:am3d="http://schemas.microsoft.com/office/drawing/2017/model3d" xmlns:o="urn:schemas-microsoft-com:office:office" xmlns:oel="http://schemas.microsoft.com/office/2019/extlst" xmlns:r="http://schemas.openxmlformats.org/officeDocument/2006/relationships" xmlns:m="http://schemas.openxmlformats.org/officeDocument/2006/math" xmlns:v="urn:schemas-microsoft-com:vml" xmlns:wp14="http://schemas.microsoft.com/office/word/2010/wordprocessingDrawing" xmlns:wp="http://schemas.openxmlformats.org/drawingml/2006/wordprocessingDrawing" xmlns:w10="urn:schemas-microsoft-com:office:word" xmlns:w="http://schemas.openxmlformats.org/wordprocessingml/2006/main" xmlns:w14="http://schemas.microsoft.com/office/word/2010/wordml" xmlns:w15="http://schemas.microsoft.com/office/word/2012/wordml" xmlns:w16cei="http://schemas.microsoft.com/office/word/2026/wordml/cei" xmlns:w16cex="http://schemas.microsoft.com/office/word/2018/wordml/cex" xmlns:w16cid="http://schemas.microsoft.com/office/word/2016/wordml/cid" xmlns:w16="http://schemas.microsoft.com/office/word/2018/wordml" xmlns:w16du="http://schemas.microsoft.com/office/word/2023/wordml/word16du" xmlns:w16sdtdh="http://schemas.microsoft.com/office/word/2020/wordml/sdtdatahash" xmlns:w16sdtfl="http://schemas.microsoft.com/office/word/2024/wordml/sdtformatlock" xmlns:w16se="http://schemas.microsoft.com/office/word/2015/wordml/symex" xmlns:wpg="http://schemas.microsoft.com/office/word/2010/wordprocessingGroup" xmlns:wpi="http://schemas.microsoft.com/office/word/2010/wordprocessingInk" xmlns:wne="http://schemas.microsoft.com/office/word/2006/wordml" xmlns:wps="http://schemas.microsoft.com/office/word/2010/wordprocessingShape" mc:Ignorable="w14 w15 w16se w16cid w16 w16cex w16sdtdh w16sdtfl w16du wp14"/>
 </file>
 
 <file path=word/styles.xml><?xml version="1.0" encoding="utf-8"?>

</xml_diff>

<commit_message>
data set downloaded from huggingface
</commit_message>
<xml_diff>
--- a/human trace features.docx
+++ b/human trace features.docx
@@ -456,8 +456,13 @@
     </w:tbl>
     <w:p/>
     <w:p>
-      <w:r>
-        <w:t>feature_engine/</w:t>
+      <w:proofErr w:type="spellStart"/>
+      <w:r>
+        <w:t>feature_engine</w:t>
+      </w:r>
+      <w:proofErr w:type="spellEnd"/>
+      <w:r>
+        <w:t>/</w:t>
       </w:r>
     </w:p>
     <w:p>
@@ -520,10 +525,12 @@
         <w:spacing w:after="0"/>
         <w:jc w:val="center"/>
       </w:pPr>
+      <w:proofErr w:type="spellStart"/>
       <w:r>
         <w:lastRenderedPageBreak/>
         <w:t>HumanTrace</w:t>
       </w:r>
+      <w:proofErr w:type="spellEnd"/>
     </w:p>
     <w:p>
       <w:pPr>
@@ -1166,8 +1173,21 @@
         <w:t>──</w:t>
       </w:r>
       <w:r>
-        <w:t xml:space="preserve"> LightGBM / XGBoost</w:t>
-      </w:r>
+        <w:t xml:space="preserve"> </w:t>
+      </w:r>
+      <w:proofErr w:type="spellStart"/>
+      <w:r>
+        <w:t>LightGBM</w:t>
+      </w:r>
+      <w:proofErr w:type="spellEnd"/>
+      <w:r>
+        <w:t xml:space="preserve"> / </w:t>
+      </w:r>
+      <w:proofErr w:type="spellStart"/>
+      <w:r>
+        <w:t>XGBoost</w:t>
+      </w:r>
+      <w:proofErr w:type="spellEnd"/>
     </w:p>
     <w:p>
       <w:pPr>
@@ -1507,8 +1527,13 @@
       <w:pPr>
         <w:spacing w:after="0"/>
       </w:pPr>
-      <w:r>
-        <w:t>HumanTrace Engine</w:t>
+      <w:proofErr w:type="spellStart"/>
+      <w:r>
+        <w:t>HumanTrace</w:t>
+      </w:r>
+      <w:proofErr w:type="spellEnd"/>
+      <w:r>
+        <w:t xml:space="preserve"> Engine</w:t>
       </w:r>
     </w:p>
     <w:p>
@@ -1718,9 +1743,14 @@
       <w:pPr>
         <w:spacing w:after="0"/>
       </w:pPr>
+      <w:proofErr w:type="spellStart"/>
       <w:r>
         <w:lastRenderedPageBreak/>
-        <w:t>humantrace/</w:t>
+        <w:t>humantrace</w:t>
+      </w:r>
+      <w:proofErr w:type="spellEnd"/>
+      <w:r>
+        <w:t>/</w:t>
       </w:r>
     </w:p>
     <w:p>
@@ -2009,7 +2039,15 @@
         <w:t>──</w:t>
       </w:r>
       <w:r>
-        <w:t xml:space="preserve"> feature_engine/</w:t>
+        <w:t xml:space="preserve"> </w:t>
+      </w:r>
+      <w:proofErr w:type="spellStart"/>
+      <w:r>
+        <w:t>feature_engine</w:t>
+      </w:r>
+      <w:proofErr w:type="spellEnd"/>
+      <w:r>
+        <w:t>/</w:t>
       </w:r>
     </w:p>
     <w:p>
@@ -2617,7 +2655,15 @@
         <w:spacing w:after="0"/>
       </w:pPr>
       <w:r>
-        <w:t>└── api/</w:t>
+        <w:t xml:space="preserve">└── </w:t>
+      </w:r>
+      <w:proofErr w:type="spellStart"/>
+      <w:r>
+        <w:t>api</w:t>
+      </w:r>
+      <w:proofErr w:type="spellEnd"/>
+      <w:r>
+        <w:t>/</w:t>
       </w:r>
     </w:p>
     <w:p>
@@ -2680,31 +2726,63 @@
         <w:spacing w:after="0"/>
       </w:pPr>
       <w:r>
-        <w:t>6. feature_engine/lexical/</w:t>
-      </w:r>
-    </w:p>
-    <w:p>
-      <w:pPr>
-        <w:spacing w:after="0"/>
-      </w:pPr>
-      <w:r>
-        <w:t>7. feature_engine/readability/</w:t>
-      </w:r>
-    </w:p>
-    <w:p>
-      <w:pPr>
-        <w:spacing w:after="0"/>
-      </w:pPr>
-      <w:r>
-        <w:t>8. feature_engine/stylometry/</w:t>
-      </w:r>
-    </w:p>
-    <w:p>
-      <w:pPr>
-        <w:spacing w:after="0"/>
-      </w:pPr>
-      <w:r>
-        <w:t>9. feature_engine/syntax/</w:t>
+        <w:t xml:space="preserve">6. </w:t>
+      </w:r>
+      <w:proofErr w:type="spellStart"/>
+      <w:r>
+        <w:t>feature_engine</w:t>
+      </w:r>
+      <w:proofErr w:type="spellEnd"/>
+      <w:r>
+        <w:t>/lexical/</w:t>
+      </w:r>
+    </w:p>
+    <w:p>
+      <w:pPr>
+        <w:spacing w:after="0"/>
+      </w:pPr>
+      <w:r>
+        <w:t xml:space="preserve">7. </w:t>
+      </w:r>
+      <w:proofErr w:type="spellStart"/>
+      <w:r>
+        <w:t>feature_engine</w:t>
+      </w:r>
+      <w:proofErr w:type="spellEnd"/>
+      <w:r>
+        <w:t>/readability/</w:t>
+      </w:r>
+    </w:p>
+    <w:p>
+      <w:pPr>
+        <w:spacing w:after="0"/>
+      </w:pPr>
+      <w:r>
+        <w:t xml:space="preserve">8. </w:t>
+      </w:r>
+      <w:proofErr w:type="spellStart"/>
+      <w:r>
+        <w:t>feature_engine</w:t>
+      </w:r>
+      <w:proofErr w:type="spellEnd"/>
+      <w:r>
+        <w:t>/stylometry/</w:t>
+      </w:r>
+    </w:p>
+    <w:p>
+      <w:pPr>
+        <w:spacing w:after="0"/>
+      </w:pPr>
+      <w:r>
+        <w:t xml:space="preserve">9. </w:t>
+      </w:r>
+      <w:proofErr w:type="spellStart"/>
+      <w:r>
+        <w:t>feature_engine</w:t>
+      </w:r>
+      <w:proofErr w:type="spellEnd"/>
+      <w:r>
+        <w:t>/syntax/</w:t>
       </w:r>
     </w:p>
     <w:p>
@@ -2878,8 +2956,13 @@
         <w:jc w:val="center"/>
       </w:pPr>
       <w:r>
-        <w:t xml:space="preserve">               EssayDocument</w:t>
-      </w:r>
+        <w:t xml:space="preserve">               </w:t>
+      </w:r>
+      <w:proofErr w:type="spellStart"/>
+      <w:r>
+        <w:t>EssayDocument</w:t>
+      </w:r>
+      <w:proofErr w:type="spellEnd"/>
     </w:p>
     <w:p>
       <w:pPr>
@@ -3520,8 +3603,13 @@
               <w:spacing w:after="0"/>
             </w:pPr>
             <w:r>
-              <w:t>Vocabulary behavior</w:t>
+              <w:t xml:space="preserve">Vocabulary </w:t>
             </w:r>
+            <w:proofErr w:type="spellStart"/>
+            <w:r>
+              <w:t>behavior</w:t>
+            </w:r>
+            <w:proofErr w:type="spellEnd"/>
           </w:p>
         </w:tc>
       </w:tr>
@@ -4746,9 +4834,11 @@
       <w:pPr>
         <w:spacing w:after="0"/>
       </w:pPr>
+      <w:proofErr w:type="spellStart"/>
       <w:r>
         <w:t>essay_id</w:t>
       </w:r>
+      <w:proofErr w:type="spellEnd"/>
     </w:p>
     <w:p>
       <w:pPr>
@@ -4778,33 +4868,52 @@
       <w:pPr>
         <w:spacing w:after="0"/>
       </w:pPr>
+      <w:proofErr w:type="spellStart"/>
       <w:r>
         <w:t>word_count</w:t>
       </w:r>
-    </w:p>
-    <w:p>
-      <w:pPr>
-        <w:spacing w:after="0"/>
-      </w:pPr>
+      <w:proofErr w:type="spellEnd"/>
+    </w:p>
+    <w:p>
+      <w:pPr>
+        <w:spacing w:after="0"/>
+      </w:pPr>
+      <w:proofErr w:type="spellStart"/>
       <w:r>
         <w:t>generation_model</w:t>
       </w:r>
-    </w:p>
-    <w:p>
-      <w:pPr>
-        <w:spacing w:after="0"/>
-      </w:pPr>
+      <w:proofErr w:type="spellEnd"/>
+    </w:p>
+    <w:p>
+      <w:pPr>
+        <w:spacing w:after="0"/>
+      </w:pPr>
+      <w:proofErr w:type="spellStart"/>
       <w:r>
         <w:t>generation_prompt</w:t>
       </w:r>
-    </w:p>
-    <w:p>
-      <w:pPr>
-        <w:spacing w:after="0"/>
-      </w:pPr>
+      <w:proofErr w:type="spellEnd"/>
+    </w:p>
+    <w:p>
+      <w:pPr>
+        <w:spacing w:after="0"/>
+      </w:pPr>
+      <w:proofErr w:type="spellStart"/>
       <w:r>
         <w:lastRenderedPageBreak/>
-        <w:t>essay_id        label          word_count    TTR    burstiness ...</w:t>
+        <w:t>essay_id</w:t>
+      </w:r>
+      <w:proofErr w:type="spellEnd"/>
+      <w:r>
+        <w:t xml:space="preserve">        label          </w:t>
+      </w:r>
+      <w:proofErr w:type="spellStart"/>
+      <w:r>
+        <w:t>word_count</w:t>
+      </w:r>
+      <w:proofErr w:type="spellEnd"/>
+      <w:r>
+        <w:t xml:space="preserve">    TTR    burstiness ...</w:t>
       </w:r>
     </w:p>
     <w:p>
@@ -5058,9 +5167,11 @@
             <w:pPr>
               <w:spacing w:after="0"/>
             </w:pPr>
+            <w:proofErr w:type="spellStart"/>
             <w:r>
               <w:t>ai_polished</w:t>
             </w:r>
+            <w:proofErr w:type="spellEnd"/>
           </w:p>
         </w:tc>
         <w:tc>
@@ -5108,9 +5219,11 @@
             <w:pPr>
               <w:spacing w:after="0"/>
             </w:pPr>
+            <w:proofErr w:type="spellStart"/>
             <w:r>
               <w:t>human_revised</w:t>
             </w:r>
+            <w:proofErr w:type="spellEnd"/>
           </w:p>
         </w:tc>
         <w:tc>
@@ -6034,7 +6147,15 @@
         <w:jc w:val="center"/>
       </w:pPr>
       <w:r>
-        <w:t>College essays       Personal essays     Public essays</w:t>
+        <w:t xml:space="preserve">College essays       Personal essays     </w:t>
+      </w:r>
+      <w:proofErr w:type="gramStart"/>
+      <w:r>
+        <w:t>Public</w:t>
+      </w:r>
+      <w:proofErr w:type="gramEnd"/>
+      <w:r>
+        <w:t xml:space="preserve"> essays</w:t>
       </w:r>
     </w:p>
     <w:p>
@@ -6104,6 +6225,189 @@
       </w:pPr>
       <w:r>
         <w:t>AI              AI-polished        Human revised</w:t>
+      </w:r>
+    </w:p>
+    <w:p>
+      <w:pPr>
+        <w:spacing w:after="0"/>
+        <w:jc w:val="center"/>
+      </w:pPr>
+    </w:p>
+    <w:p>
+      <w:pPr>
+        <w:spacing w:after="0"/>
+      </w:pPr>
+    </w:p>
+    <w:p>
+      <w:pPr>
+        <w:spacing w:after="0"/>
+        <w:jc w:val="center"/>
+      </w:pPr>
+      <w:r>
+        <w:t>Datasets</w:t>
+      </w:r>
+    </w:p>
+    <w:p>
+      <w:pPr>
+        <w:spacing w:after="0"/>
+        <w:jc w:val="center"/>
+      </w:pPr>
+      <w:r>
+        <w:t>↓</w:t>
+      </w:r>
+    </w:p>
+    <w:p>
+      <w:pPr>
+        <w:spacing w:after="0"/>
+        <w:jc w:val="center"/>
+      </w:pPr>
+      <w:r>
+        <w:t>Preprocessing</w:t>
+      </w:r>
+    </w:p>
+    <w:p>
+      <w:pPr>
+        <w:spacing w:after="0"/>
+        <w:jc w:val="center"/>
+      </w:pPr>
+      <w:r>
+        <w:t>↓</w:t>
+      </w:r>
+    </w:p>
+    <w:p>
+      <w:pPr>
+        <w:spacing w:after="0"/>
+        <w:jc w:val="center"/>
+      </w:pPr>
+      <w:r>
+        <w:t>Feature Engine</w:t>
+      </w:r>
+    </w:p>
+    <w:p>
+      <w:pPr>
+        <w:spacing w:after="0"/>
+        <w:jc w:val="center"/>
+      </w:pPr>
+      <w:r>
+        <w:t>↓</w:t>
+      </w:r>
+    </w:p>
+    <w:p>
+      <w:pPr>
+        <w:spacing w:after="0"/>
+        <w:jc w:val="center"/>
+      </w:pPr>
+      <w:r>
+        <w:t>Feature Matrix</w:t>
+      </w:r>
+    </w:p>
+    <w:p>
+      <w:pPr>
+        <w:spacing w:after="0"/>
+        <w:jc w:val="center"/>
+      </w:pPr>
+      <w:r>
+        <w:t>↓</w:t>
+      </w:r>
+    </w:p>
+    <w:p>
+      <w:pPr>
+        <w:spacing w:after="0"/>
+        <w:jc w:val="center"/>
+      </w:pPr>
+      <w:r>
+        <w:t>Feature Selection</w:t>
+      </w:r>
+    </w:p>
+    <w:p>
+      <w:pPr>
+        <w:spacing w:after="0"/>
+        <w:jc w:val="center"/>
+      </w:pPr>
+      <w:r>
+        <w:t>↓</w:t>
+      </w:r>
+    </w:p>
+    <w:p>
+      <w:pPr>
+        <w:spacing w:after="0"/>
+        <w:jc w:val="center"/>
+      </w:pPr>
+      <w:r>
+        <w:t>Training</w:t>
+      </w:r>
+    </w:p>
+    <w:p>
+      <w:pPr>
+        <w:spacing w:after="0"/>
+        <w:jc w:val="center"/>
+      </w:pPr>
+      <w:r>
+        <w:lastRenderedPageBreak/>
+        <w:t>↓</w:t>
+      </w:r>
+    </w:p>
+    <w:p>
+      <w:pPr>
+        <w:spacing w:after="0"/>
+        <w:jc w:val="center"/>
+      </w:pPr>
+      <w:r>
+        <w:t>Evaluation</w:t>
+      </w:r>
+    </w:p>
+    <w:p>
+      <w:pPr>
+        <w:spacing w:after="0"/>
+        <w:jc w:val="center"/>
+      </w:pPr>
+      <w:r>
+        <w:t>↓</w:t>
+      </w:r>
+    </w:p>
+    <w:p>
+      <w:pPr>
+        <w:spacing w:after="0"/>
+        <w:jc w:val="center"/>
+      </w:pPr>
+      <w:r>
+        <w:t>Explainability</w:t>
+      </w:r>
+    </w:p>
+    <w:p>
+      <w:pPr>
+        <w:spacing w:after="0"/>
+        <w:jc w:val="center"/>
+      </w:pPr>
+      <w:r>
+        <w:t>↓</w:t>
+      </w:r>
+    </w:p>
+    <w:p>
+      <w:pPr>
+        <w:spacing w:after="0"/>
+        <w:jc w:val="center"/>
+      </w:pPr>
+      <w:r>
+        <w:t>Flask API</w:t>
+      </w:r>
+    </w:p>
+    <w:p>
+      <w:pPr>
+        <w:spacing w:after="0"/>
+        <w:jc w:val="center"/>
+      </w:pPr>
+      <w:r>
+        <w:t>↓</w:t>
+      </w:r>
+    </w:p>
+    <w:p>
+      <w:pPr>
+        <w:spacing w:after="0"/>
+        <w:jc w:val="center"/>
+      </w:pPr>
+      <w:r>
+        <w:t>Frontend</w:t>
       </w:r>
     </w:p>
     <w:sectPr>
@@ -6114,10 +6418,6 @@
     </w:sectPr>
   </w:body>
 </w:document>
-</file>
-
-<file path=word/numbering.xml><?xml version="1.0" encoding="utf-8"?>
-<w:numbering xmlns:wpc="http://schemas.microsoft.com/office/word/2010/wordprocessingCanvas" xmlns:cx="http://schemas.microsoft.com/office/drawing/2014/chartex" xmlns:cx1="http://schemas.microsoft.com/office/drawing/2015/9/8/chartex" xmlns:cx2="http://schemas.microsoft.com/office/drawing/2015/10/21/chartex" xmlns:cx3="http://schemas.microsoft.com/office/drawing/2016/5/9/chartex" xmlns:cx4="http://schemas.microsoft.com/office/drawing/2016/5/10/chartex" xmlns:cx5="http://schemas.microsoft.com/office/drawing/2016/5/11/chartex" xmlns:cx6="http://schemas.microsoft.com/office/drawing/2016/5/12/chartex" xmlns:cx7="http://schemas.microsoft.com/office/drawing/2016/5/13/chartex" xmlns:cx8="http://schemas.microsoft.com/office/drawing/2016/5/14/chartex" xmlns:mc="http://schemas.openxmlformats.org/markup-compatibility/2006" xmlns:aink="http://schemas.microsoft.com/office/drawing/2016/ink" xmlns:am3d="http://schemas.microsoft.com/office/drawing/2017/model3d" xmlns:o="urn:schemas-microsoft-com:office:office" xmlns:oel="http://schemas.microsoft.com/office/2019/extlst" xmlns:r="http://schemas.openxmlformats.org/officeDocument/2006/relationships" xmlns:m="http://schemas.openxmlformats.org/officeDocument/2006/math" xmlns:v="urn:schemas-microsoft-com:vml" xmlns:wp14="http://schemas.microsoft.com/office/word/2010/wordprocessingDrawing" xmlns:wp="http://schemas.openxmlformats.org/drawingml/2006/wordprocessingDrawing" xmlns:w10="urn:schemas-microsoft-com:office:word" xmlns:w="http://schemas.openxmlformats.org/wordprocessingml/2006/main" xmlns:w14="http://schemas.microsoft.com/office/word/2010/wordml" xmlns:w15="http://schemas.microsoft.com/office/word/2012/wordml" xmlns:w16cei="http://schemas.microsoft.com/office/word/2026/wordml/cei" xmlns:w16cex="http://schemas.microsoft.com/office/word/2018/wordml/cex" xmlns:w16cid="http://schemas.microsoft.com/office/word/2016/wordml/cid" xmlns:w16="http://schemas.microsoft.com/office/word/2018/wordml" xmlns:w16du="http://schemas.microsoft.com/office/word/2023/wordml/word16du" xmlns:w16sdtdh="http://schemas.microsoft.com/office/word/2020/wordml/sdtdatahash" xmlns:w16sdtfl="http://schemas.microsoft.com/office/word/2024/wordml/sdtformatlock" xmlns:w16se="http://schemas.microsoft.com/office/word/2015/wordml/symex" xmlns:wpg="http://schemas.microsoft.com/office/word/2010/wordprocessingGroup" xmlns:wpi="http://schemas.microsoft.com/office/word/2010/wordprocessingInk" xmlns:wne="http://schemas.microsoft.com/office/word/2006/wordml" xmlns:wps="http://schemas.microsoft.com/office/word/2010/wordprocessingShape" mc:Ignorable="w14 w15 w16se w16cid w16 w16cex w16sdtdh w16sdtfl w16du wp14"/>
 </file>
 
 <file path=word/styles.xml><?xml version="1.0" encoding="utf-8"?>

</xml_diff>